<commit_message>
added notes in the doc file
</commit_message>
<xml_diff>
--- a/Codata Assignment.docx
+++ b/Codata Assignment.docx
@@ -1,17 +1,17 @@
 
 <file path=word/document.xml><?xml version="1.0" encoding="utf-8"?>
-<w:document xmlns:wpc="http://schemas.microsoft.com/office/word/2010/wordprocessingCanvas" xmlns:cx="http://schemas.microsoft.com/office/drawing/2014/chartex" xmlns:cx1="http://schemas.microsoft.com/office/drawing/2015/9/8/chartex" xmlns:cx2="http://schemas.microsoft.com/office/drawing/2015/10/21/chartex" xmlns:cx3="http://schemas.microsoft.com/office/drawing/2016/5/9/chartex" xmlns:cx4="http://schemas.microsoft.com/office/drawing/2016/5/10/chartex" xmlns:cx5="http://schemas.microsoft.com/office/drawing/2016/5/11/chartex" xmlns:cx6="http://schemas.microsoft.com/office/drawing/2016/5/12/chartex" xmlns:cx7="http://schemas.microsoft.com/office/drawing/2016/5/13/chartex" xmlns:cx8="http://schemas.microsoft.com/office/drawing/2016/5/14/chartex" xmlns:mc="http://schemas.openxmlformats.org/markup-compatibility/2006" xmlns:m="http://schemas.openxmlformats.org/officeDocument/2006/math" xmlns:aink="http://schemas.microsoft.com/office/drawing/2016/ink" xmlns:am3d="http://schemas.microsoft.com/office/drawing/2017/model3d" xmlns:oel="http://schemas.microsoft.com/office/2019/extlst" xmlns:r="http://schemas.openxmlformats.org/officeDocument/2006/relationships" xmlns:wp14="http://schemas.microsoft.com/office/word/2010/wordprocessingDrawing" xmlns:wp="http://schemas.openxmlformats.org/drawingml/2006/wordprocessingDrawing" xmlns:wpg="http://schemas.microsoft.com/office/word/2010/wordprocessingGroup" xmlns:wpi="http://schemas.microsoft.com/office/word/2010/wordprocessingInk" xmlns:wps="http://schemas.microsoft.com/office/word/2010/wordprocessingShape" xmlns:o="urn:schemas-microsoft-com:office:office" xmlns:v="urn:schemas-microsoft-com:vml" xmlns:w10="urn:schemas-microsoft-com:office:word" xmlns:w="http://schemas.openxmlformats.org/wordprocessingml/2006/main" xmlns:w14="http://schemas.microsoft.com/office/word/2010/wordml" xmlns:w15="http://schemas.microsoft.com/office/word/2012/wordml" xmlns:w16cex="http://schemas.microsoft.com/office/word/2018/wordml/cex" xmlns:w16cid="http://schemas.microsoft.com/office/word/2016/wordml/cid" xmlns:w16="http://schemas.microsoft.com/office/word/2018/wordml" xmlns:w16sdtdh="http://schemas.microsoft.com/office/word/2020/wordml/sdtdatahash" xmlns:w16sdtfl="http://schemas.microsoft.com/office/word/2024/wordml/sdtformatlock" xmlns:w16se="http://schemas.microsoft.com/office/word/2015/wordml/symex" xmlns:w16du="http://schemas.microsoft.com/office/word/2023/wordml/word16du" xmlns:wne="http://schemas.microsoft.com/office/word/2006/wordml" mc:Ignorable="w14 w15 w16se w16cid w16 w16cex w16sdtdh w16sdtfl w16du wp14">
+<w:document xmlns:wpc="http://schemas.microsoft.com/office/word/2010/wordprocessingCanvas" xmlns:mc="http://schemas.openxmlformats.org/markup-compatibility/2006" xmlns:o="urn:schemas-microsoft-com:office:office" xmlns:r="http://schemas.openxmlformats.org/officeDocument/2006/relationships" xmlns:m="http://schemas.openxmlformats.org/officeDocument/2006/math" xmlns:v="urn:schemas-microsoft-com:vml" xmlns:wp14="http://schemas.microsoft.com/office/word/2010/wordprocessingDrawing" xmlns:wp="http://schemas.openxmlformats.org/drawingml/2006/wordprocessingDrawing" xmlns:w10="urn:schemas-microsoft-com:office:word" xmlns:w="http://schemas.openxmlformats.org/wordprocessingml/2006/main" xmlns:w14="http://schemas.microsoft.com/office/word/2010/wordml" xmlns:w15="http://schemas.microsoft.com/office/word/2012/wordml" xmlns:w16se="http://schemas.microsoft.com/office/word/2015/wordml/symex" xmlns:w16cid="http://schemas.microsoft.com/office/word/2016/wordml/cid" xmlns:w16="http://schemas.microsoft.com/office/word/2018/wordml" xmlns:w16cex="http://schemas.microsoft.com/office/word/2018/wordml/cex" xmlns:w16sdtdh="http://schemas.microsoft.com/office/word/2020/wordml/sdtdatahash" xmlns:wne="http://schemas.microsoft.com/office/word/2006/wordml" xmlns:wpg="http://schemas.microsoft.com/office/word/2010/wordprocessingGroup" xmlns:wps="http://schemas.microsoft.com/office/word/2010/wordprocessingShape" mc:Ignorable="w14 w15 w16se w16cid w16 w16cex w16sdtdh wp14">
   <w:body>
     <w:p>
       <w:pPr>
         <w:pStyle w:val="Heading1"/>
-        <w:rPr>
-          <w:lang w:val="en-GB"/>
-        </w:rPr>
-      </w:pPr>
-      <w:r>
-        <w:rPr>
-          <w:lang w:val="en-GB"/>
+      </w:pPr>
+      <w:r>
+        <w:rPr>
+          <w:rFonts w:ascii="Aptos Display" w:hAnsi="Aptos Display" w:cs="Aptos Display" w:asciiTheme="majorHAnsi" w:hAnsiTheme="majorHAnsi" w:eastAsiaTheme="majorEastAsia" w:csTheme="majorBidi"/>
+          <w:color w:val="0F4761" w:themeColor="accent1" w:themeShade="BF"/>
+          <w:sz w:val="40"/>
+          <w:szCs w:val="40"/>
         </w:rPr>
         <w:t>Codata Assignment:</w:t>
       </w:r>
@@ -19,85 +19,73 @@
     <w:p>
       <w:pPr>
         <w:pStyle w:val="Heading2"/>
-        <w:rPr>
-          <w:lang w:val="en-GB"/>
-        </w:rPr>
-      </w:pPr>
-      <w:r>
-        <w:rPr>
-          <w:lang w:val="en-GB"/>
+      </w:pPr>
+      <w:r>
+        <w:rPr>
+          <w:rFonts w:ascii="Aptos Display" w:hAnsi="Aptos Display" w:cs="Aptos Display" w:asciiTheme="majorHAnsi" w:hAnsiTheme="majorHAnsi" w:eastAsiaTheme="majorEastAsia" w:csTheme="majorBidi"/>
+          <w:color w:val="0F4761" w:themeColor="accent1" w:themeShade="BF"/>
+          <w:sz w:val="32"/>
+          <w:szCs w:val="32"/>
         </w:rPr>
         <w:t xml:space="preserve">Goal: </w:t>
       </w:r>
     </w:p>
     <w:p>
-      <w:pPr>
-        <w:rPr>
-          <w:lang w:val="en-GB"/>
-        </w:rPr>
-      </w:pPr>
-      <w:r>
-        <w:rPr>
-          <w:lang w:val="en-GB"/>
+      <w:r>
+        <w:rPr>
+          <w:rFonts w:ascii="Aptos" w:hAnsi="Aptos" w:eastAsia="Aptos" w:cs="Aptos" w:asciiTheme="minorHAnsi" w:hAnsiTheme="minorHAnsi" w:eastAsiaTheme="minorHAnsi" w:csTheme="minorBidi"/>
+          <w:sz w:val="24"/>
+          <w:szCs w:val="24"/>
         </w:rPr>
         <w:t>Text-to-Wikidata Entity Linking:</w:t>
       </w:r>
     </w:p>
-    <w:p>
-      <w:pPr>
-        <w:rPr>
-          <w:lang w:val="en-GB"/>
-        </w:rPr>
-      </w:pPr>
-    </w:p>
-    <w:p>
-      <w:pPr>
-        <w:rPr>
-          <w:lang w:val="en-GB"/>
-        </w:rPr>
-      </w:pPr>
-      <w:r>
-        <w:rPr>
-          <w:lang w:val="en-GB"/>
+    <w:p/>
+    <w:p>
+      <w:r>
+        <w:rPr>
+          <w:rFonts w:ascii="Aptos" w:hAnsi="Aptos" w:eastAsia="Aptos" w:cs="Aptos" w:asciiTheme="minorHAnsi" w:hAnsiTheme="minorHAnsi" w:eastAsiaTheme="minorHAnsi" w:csTheme="minorBidi"/>
+          <w:sz w:val="24"/>
+          <w:szCs w:val="24"/>
         </w:rPr>
         <w:t xml:space="preserve">A </w:t>
       </w:r>
       <w:r>
         <w:rPr>
-          <w:lang w:val="en-GB"/>
+          <w:rFonts w:ascii="Aptos" w:hAnsi="Aptos" w:eastAsia="Aptos" w:cs="Aptos" w:asciiTheme="minorHAnsi" w:hAnsiTheme="minorHAnsi" w:eastAsiaTheme="minorHAnsi" w:csTheme="minorBidi"/>
+          <w:sz w:val="24"/>
+          <w:szCs w:val="24"/>
         </w:rPr>
         <w:t>P</w:t>
       </w:r>
       <w:r>
         <w:rPr>
-          <w:lang w:val="en-GB"/>
+          <w:rFonts w:ascii="Aptos" w:hAnsi="Aptos" w:eastAsia="Aptos" w:cs="Aptos" w:asciiTheme="minorHAnsi" w:hAnsiTheme="minorHAnsi" w:eastAsiaTheme="minorHAnsi" w:csTheme="minorBidi"/>
+          <w:sz w:val="24"/>
+          <w:szCs w:val="24"/>
         </w:rPr>
         <w:t>ython pipeline that identifies me</w:t>
       </w:r>
       <w:r>
         <w:rPr>
-          <w:lang w:val="en-GB"/>
+          <w:rFonts w:ascii="Aptos" w:hAnsi="Aptos" w:eastAsia="Aptos" w:cs="Aptos" w:asciiTheme="minorHAnsi" w:hAnsiTheme="minorHAnsi" w:eastAsiaTheme="minorHAnsi" w:csTheme="minorBidi"/>
+          <w:sz w:val="24"/>
+          <w:szCs w:val="24"/>
         </w:rPr>
         <w:t>aningful terms in a text and links those meaningful terms to the right concept in Wikidata.</w:t>
       </w:r>
     </w:p>
-    <w:p>
-      <w:pPr>
-        <w:rPr>
-          <w:lang w:val="en-GB"/>
-        </w:rPr>
-      </w:pPr>
-    </w:p>
+    <w:p/>
     <w:p>
       <w:pPr>
         <w:pStyle w:val="Heading2"/>
-        <w:rPr>
-          <w:lang w:val="de-DE"/>
-        </w:rPr>
-      </w:pPr>
-      <w:r>
-        <w:rPr>
-          <w:lang w:val="de-DE"/>
+      </w:pPr>
+      <w:r>
+        <w:rPr>
+          <w:rFonts w:ascii="Aptos Display" w:hAnsi="Aptos Display" w:cs="Aptos Display" w:asciiTheme="majorHAnsi" w:hAnsiTheme="majorHAnsi" w:eastAsiaTheme="majorEastAsia" w:csTheme="majorBidi"/>
+          <w:color w:val="0F4761" w:themeColor="accent1" w:themeShade="BF"/>
+          <w:sz w:val="32"/>
+          <w:szCs w:val="32"/>
         </w:rPr>
         <w:t>Key pointers:</w:t>
       </w:r>
@@ -109,13 +97,13 @@
           <w:ilvl w:val="0"/>
           <w:numId w:val="1"/>
         </w:numPr>
-        <w:rPr>
-          <w:lang w:val="de-DE"/>
-        </w:rPr>
-      </w:pPr>
-      <w:r>
-        <w:rPr>
-          <w:lang w:val="de-DE"/>
+        <w:ind w:left="720" w:hanging="360"/>
+      </w:pPr>
+      <w:r>
+        <w:rPr>
+          <w:rFonts w:ascii="Aptos" w:hAnsi="Aptos" w:eastAsia="Aptos" w:cs="Aptos" w:asciiTheme="minorHAnsi" w:hAnsiTheme="minorHAnsi" w:eastAsiaTheme="minorHAnsi" w:csTheme="minorBidi"/>
+          <w:sz w:val="24"/>
+          <w:szCs w:val="24"/>
         </w:rPr>
         <w:t>Entity linking to Wikidata</w:t>
       </w:r>
@@ -127,70 +115,76 @@
           <w:ilvl w:val="0"/>
           <w:numId w:val="1"/>
         </w:numPr>
-        <w:rPr>
-          <w:lang w:val="en-GB"/>
-        </w:rPr>
-      </w:pPr>
-      <w:r>
-        <w:rPr>
-          <w:lang w:val="en-GB"/>
+        <w:ind w:left="720" w:hanging="360"/>
+      </w:pPr>
+      <w:r>
+        <w:rPr>
+          <w:rFonts w:ascii="Aptos" w:hAnsi="Aptos" w:eastAsia="Aptos" w:cs="Aptos" w:asciiTheme="minorHAnsi" w:hAnsiTheme="minorHAnsi" w:eastAsiaTheme="minorHAnsi" w:csTheme="minorBidi"/>
+          <w:sz w:val="24"/>
+          <w:szCs w:val="24"/>
         </w:rPr>
         <w:t xml:space="preserve">Using </w:t>
       </w:r>
       <w:r>
         <w:rPr>
-          <w:lang w:val="en-GB"/>
+          <w:rFonts w:ascii="Aptos" w:hAnsi="Aptos" w:eastAsia="Aptos" w:cs="Aptos" w:asciiTheme="minorHAnsi" w:hAnsiTheme="minorHAnsi" w:eastAsiaTheme="minorHAnsi" w:csTheme="minorBidi"/>
+          <w:sz w:val="24"/>
+          <w:szCs w:val="24"/>
         </w:rPr>
         <w:t xml:space="preserve">a </w:t>
       </w:r>
       <w:r>
         <w:rPr>
-          <w:lang w:val="en-GB"/>
+          <w:rFonts w:ascii="Aptos" w:hAnsi="Aptos" w:eastAsia="Aptos" w:cs="Aptos" w:asciiTheme="minorHAnsi" w:hAnsiTheme="minorHAnsi" w:eastAsiaTheme="minorHAnsi" w:csTheme="minorBidi"/>
+          <w:sz w:val="24"/>
+          <w:szCs w:val="24"/>
         </w:rPr>
         <w:t>GraphRAG</w:t>
       </w:r>
       <w:r>
         <w:rPr>
-          <w:lang w:val="en-GB"/>
+          <w:rFonts w:ascii="Aptos" w:hAnsi="Aptos" w:eastAsia="Aptos" w:cs="Aptos" w:asciiTheme="minorHAnsi" w:hAnsiTheme="minorHAnsi" w:eastAsiaTheme="minorHAnsi" w:csTheme="minorBidi"/>
+          <w:sz w:val="24"/>
+          <w:szCs w:val="24"/>
         </w:rPr>
         <w:t>-inspired approach based on RDF (SKOS)</w:t>
       </w:r>
       <w:r>
         <w:rPr>
-          <w:lang w:val="en-GB"/>
+          <w:rFonts w:ascii="Aptos" w:hAnsi="Aptos" w:eastAsia="Aptos" w:cs="Aptos" w:asciiTheme="minorHAnsi" w:hAnsiTheme="minorHAnsi" w:eastAsiaTheme="minorHAnsi" w:csTheme="minorBidi"/>
+          <w:sz w:val="24"/>
+          <w:szCs w:val="24"/>
         </w:rPr>
         <w:t xml:space="preserve">: for </w:t>
       </w:r>
       <w:r>
         <w:rPr>
-          <w:lang w:val="en-GB"/>
+          <w:rFonts w:ascii="Aptos" w:hAnsi="Aptos" w:eastAsia="Aptos" w:cs="Aptos" w:asciiTheme="minorHAnsi" w:hAnsiTheme="minorHAnsi" w:eastAsiaTheme="minorHAnsi" w:csTheme="minorBidi"/>
+          <w:sz w:val="24"/>
+          <w:szCs w:val="24"/>
         </w:rPr>
         <w:t xml:space="preserve">the </w:t>
       </w:r>
       <w:r>
         <w:rPr>
-          <w:lang w:val="en-GB"/>
+          <w:rFonts w:ascii="Aptos" w:hAnsi="Aptos" w:eastAsia="Aptos" w:cs="Aptos" w:asciiTheme="minorHAnsi" w:hAnsiTheme="minorHAnsi" w:eastAsiaTheme="minorHAnsi" w:csTheme="minorBidi"/>
+          <w:sz w:val="24"/>
+          <w:szCs w:val="24"/>
         </w:rPr>
         <w:t>ranking part</w:t>
       </w:r>
     </w:p>
-    <w:p>
-      <w:pPr>
-        <w:rPr>
-          <w:lang w:val="en-GB"/>
-        </w:rPr>
-      </w:pPr>
-    </w:p>
+    <w:p/>
     <w:p>
       <w:pPr>
         <w:pStyle w:val="Heading2"/>
-        <w:rPr>
-          <w:lang w:val="en-GB"/>
-        </w:rPr>
-      </w:pPr>
-      <w:r>
-        <w:rPr>
-          <w:lang w:val="en-GB"/>
+      </w:pPr>
+      <w:r>
+        <w:rPr>
+          <w:rFonts w:ascii="Aptos Display" w:hAnsi="Aptos Display" w:cs="Aptos Display" w:asciiTheme="majorHAnsi" w:hAnsiTheme="majorHAnsi" w:eastAsiaTheme="majorEastAsia" w:csTheme="majorBidi"/>
+          <w:color w:val="0F4761" w:themeColor="accent1" w:themeShade="BF"/>
+          <w:sz w:val="32"/>
+          <w:szCs w:val="32"/>
         </w:rPr>
         <w:t>Entity linking pipeline:</w:t>
       </w:r>
@@ -202,45 +196,53 @@
           <w:ilvl w:val="0"/>
           <w:numId w:val="2"/>
         </w:numPr>
-        <w:rPr>
-          <w:lang w:val="en-GB"/>
-        </w:rPr>
-      </w:pPr>
-      <w:r>
-        <w:rPr>
-          <w:lang w:val="en-GB"/>
+        <w:ind w:left="720" w:hanging="360"/>
+      </w:pPr>
+      <w:r>
+        <w:rPr>
+          <w:rFonts w:ascii="Aptos" w:hAnsi="Aptos" w:eastAsia="Aptos" w:cs="Aptos" w:asciiTheme="minorHAnsi" w:hAnsiTheme="minorHAnsi" w:eastAsiaTheme="minorHAnsi" w:csTheme="minorBidi"/>
+          <w:sz w:val="24"/>
+          <w:szCs w:val="24"/>
         </w:rPr>
         <w:t>Candidate generator/</w:t>
       </w:r>
-      <w:proofErr w:type="gramStart"/>
-      <w:r>
-        <w:rPr>
-          <w:lang w:val="en-GB"/>
+      <w:r>
+        <w:rPr>
+          <w:rFonts w:ascii="Aptos" w:hAnsi="Aptos" w:eastAsia="Aptos" w:cs="Aptos" w:asciiTheme="minorHAnsi" w:hAnsiTheme="minorHAnsi" w:eastAsiaTheme="minorHAnsi" w:csTheme="minorBidi"/>
+          <w:sz w:val="24"/>
+          <w:szCs w:val="24"/>
         </w:rPr>
         <w:t>retriever</w:t>
       </w:r>
       <w:r>
         <w:rPr>
-          <w:lang w:val="en-GB"/>
+          <w:rFonts w:ascii="Aptos" w:hAnsi="Aptos" w:eastAsia="Aptos" w:cs="Aptos" w:asciiTheme="minorHAnsi" w:hAnsiTheme="minorHAnsi" w:eastAsiaTheme="minorHAnsi" w:csTheme="minorBidi"/>
+          <w:sz w:val="24"/>
+          <w:szCs w:val="24"/>
         </w:rPr>
         <w:t>:</w:t>
       </w:r>
-      <w:proofErr w:type="gramEnd"/>
-      <w:r>
-        <w:rPr>
-          <w:lang w:val="en-GB"/>
+      <w:r>
+        <w:rPr>
+          <w:rFonts w:ascii="Aptos" w:hAnsi="Aptos" w:eastAsia="Aptos" w:cs="Aptos" w:asciiTheme="minorHAnsi" w:hAnsiTheme="minorHAnsi" w:eastAsiaTheme="minorHAnsi" w:csTheme="minorBidi"/>
+          <w:sz w:val="24"/>
+          <w:szCs w:val="24"/>
         </w:rPr>
         <w:t xml:space="preserve"> retrieves the potential candidate</w:t>
       </w:r>
       <w:r>
         <w:rPr>
-          <w:lang w:val="en-GB"/>
+          <w:rFonts w:ascii="Aptos" w:hAnsi="Aptos" w:eastAsia="Aptos" w:cs="Aptos" w:asciiTheme="minorHAnsi" w:hAnsiTheme="minorHAnsi" w:eastAsiaTheme="minorHAnsi" w:csTheme="minorBidi"/>
+          <w:sz w:val="24"/>
+          <w:szCs w:val="24"/>
         </w:rPr>
         <w:t>s</w:t>
       </w:r>
       <w:r>
         <w:rPr>
-          <w:lang w:val="en-GB"/>
+          <w:rFonts w:ascii="Aptos" w:hAnsi="Aptos" w:eastAsia="Aptos" w:cs="Aptos" w:asciiTheme="minorHAnsi" w:hAnsiTheme="minorHAnsi" w:eastAsiaTheme="minorHAnsi" w:csTheme="minorBidi"/>
+          <w:sz w:val="24"/>
+          <w:szCs w:val="24"/>
         </w:rPr>
         <w:t xml:space="preserve"> from Wikidata</w:t>
       </w:r>
@@ -252,19 +254,21 @@
           <w:ilvl w:val="0"/>
           <w:numId w:val="2"/>
         </w:numPr>
-        <w:rPr>
-          <w:lang w:val="en-GB"/>
-        </w:rPr>
-      </w:pPr>
-      <w:r>
-        <w:rPr>
-          <w:lang w:val="en-GB"/>
+        <w:ind w:left="720" w:hanging="360"/>
+      </w:pPr>
+      <w:r>
+        <w:rPr>
+          <w:rFonts w:ascii="Aptos" w:hAnsi="Aptos" w:eastAsia="Aptos" w:cs="Aptos" w:asciiTheme="minorHAnsi" w:hAnsiTheme="minorHAnsi" w:eastAsiaTheme="minorHAnsi" w:csTheme="minorBidi"/>
+          <w:sz w:val="24"/>
+          <w:szCs w:val="24"/>
         </w:rPr>
         <w:t>Candidate ranke</w:t>
       </w:r>
       <w:r>
         <w:rPr>
-          <w:lang w:val="en-GB"/>
+          <w:rFonts w:ascii="Aptos" w:hAnsi="Aptos" w:eastAsia="Aptos" w:cs="Aptos" w:asciiTheme="minorHAnsi" w:hAnsiTheme="minorHAnsi" w:eastAsiaTheme="minorHAnsi" w:csTheme="minorBidi"/>
+          <w:sz w:val="24"/>
+          <w:szCs w:val="24"/>
         </w:rPr>
         <w:t>r: ranks the candidates and helps select the most similar candidate to the mention using semantic similarity.</w:t>
       </w:r>
@@ -272,9 +276,6 @@
     <w:p>
       <w:pPr>
         <w:pStyle w:val="ListParagraph"/>
-        <w:rPr>
-          <w:lang w:val="en-GB"/>
-        </w:rPr>
       </w:pPr>
     </w:p>
     <w:p>
@@ -282,11 +283,22 @@
         <w:pStyle w:val="Heading2"/>
       </w:pPr>
       <w:r>
+        <w:rPr>
+          <w:rFonts w:ascii="Aptos Display" w:hAnsi="Aptos Display" w:cs="Aptos Display" w:asciiTheme="majorHAnsi" w:hAnsiTheme="majorHAnsi" w:eastAsiaTheme="majorEastAsia" w:csTheme="majorBidi"/>
+          <w:color w:val="0F4761" w:themeColor="accent1" w:themeShade="BF"/>
+          <w:sz w:val="32"/>
+          <w:szCs w:val="32"/>
+        </w:rPr>
         <w:t xml:space="preserve">Input: </w:t>
       </w:r>
     </w:p>
     <w:p>
       <w:r>
+        <w:rPr>
+          <w:rFonts w:ascii="Aptos" w:hAnsi="Aptos" w:eastAsia="Aptos" w:cs="Aptos" w:asciiTheme="minorHAnsi" w:hAnsiTheme="minorHAnsi" w:eastAsiaTheme="minorHAnsi" w:csTheme="minorBidi"/>
+          <w:sz w:val="24"/>
+          <w:szCs w:val="24"/>
+        </w:rPr>
         <w:t>Unstructured text</w:t>
       </w:r>
     </w:p>
@@ -296,20 +308,46 @@
         <w:pStyle w:val="Heading2"/>
       </w:pPr>
       <w:r>
+        <w:rPr>
+          <w:rFonts w:ascii="Aptos Display" w:hAnsi="Aptos Display" w:cs="Aptos Display" w:asciiTheme="majorHAnsi" w:hAnsiTheme="majorHAnsi" w:eastAsiaTheme="majorEastAsia" w:csTheme="majorBidi"/>
+          <w:color w:val="0F4761" w:themeColor="accent1" w:themeShade="BF"/>
+          <w:sz w:val="32"/>
+          <w:szCs w:val="32"/>
+        </w:rPr>
         <w:t xml:space="preserve">Output: </w:t>
       </w:r>
     </w:p>
     <w:p>
       <w:r>
+        <w:rPr>
+          <w:rFonts w:ascii="Aptos" w:hAnsi="Aptos" w:eastAsia="Aptos" w:cs="Aptos" w:asciiTheme="minorHAnsi" w:hAnsiTheme="minorHAnsi" w:eastAsiaTheme="minorHAnsi" w:csTheme="minorBidi"/>
+          <w:sz w:val="24"/>
+          <w:szCs w:val="24"/>
+        </w:rPr>
         <w:t>Table</w:t>
       </w:r>
       <w:r>
+        <w:rPr>
+          <w:rFonts w:ascii="Aptos" w:hAnsi="Aptos" w:eastAsia="Aptos" w:cs="Aptos" w:asciiTheme="minorHAnsi" w:hAnsiTheme="minorHAnsi" w:eastAsiaTheme="minorHAnsi" w:csTheme="minorBidi"/>
+          <w:sz w:val="24"/>
+          <w:szCs w:val="24"/>
+        </w:rPr>
         <w:t>/Datafram</w:t>
       </w:r>
       <w:r>
+        <w:rPr>
+          <w:rFonts w:ascii="Aptos" w:hAnsi="Aptos" w:eastAsia="Aptos" w:cs="Aptos" w:asciiTheme="minorHAnsi" w:hAnsiTheme="minorHAnsi" w:eastAsiaTheme="minorHAnsi" w:csTheme="minorBidi"/>
+          <w:sz w:val="24"/>
+          <w:szCs w:val="24"/>
+        </w:rPr>
         <w:t>e</w:t>
       </w:r>
       <w:r>
+        <w:rPr>
+          <w:rFonts w:ascii="Aptos" w:hAnsi="Aptos" w:eastAsia="Aptos" w:cs="Aptos" w:asciiTheme="minorHAnsi" w:hAnsiTheme="minorHAnsi" w:eastAsiaTheme="minorHAnsi" w:csTheme="minorBidi"/>
+          <w:sz w:val="24"/>
+          <w:szCs w:val="24"/>
+        </w:rPr>
         <w:t>: mention, candidate concept from Wikidata, Wikidata ID, conference</w:t>
       </w:r>
     </w:p>
@@ -319,12 +357,30 @@
         <w:pStyle w:val="Heading2"/>
       </w:pPr>
       <w:r>
+        <w:rPr>
+          <w:rFonts w:ascii="Aptos Display" w:hAnsi="Aptos Display" w:cs="Aptos Display" w:asciiTheme="majorHAnsi" w:hAnsiTheme="majorHAnsi" w:eastAsiaTheme="majorEastAsia" w:csTheme="majorBidi"/>
+          <w:color w:val="0F4761" w:themeColor="accent1" w:themeShade="BF"/>
+          <w:sz w:val="32"/>
+          <w:szCs w:val="32"/>
+        </w:rPr>
         <w:t>Architecture</w:t>
       </w:r>
       <w:r>
+        <w:rPr>
+          <w:rFonts w:ascii="Aptos Display" w:hAnsi="Aptos Display" w:cs="Aptos Display" w:asciiTheme="majorHAnsi" w:hAnsiTheme="majorHAnsi" w:eastAsiaTheme="majorEastAsia" w:csTheme="majorBidi"/>
+          <w:color w:val="0F4761" w:themeColor="accent1" w:themeShade="BF"/>
+          <w:sz w:val="32"/>
+          <w:szCs w:val="32"/>
+        </w:rPr>
         <w:t xml:space="preserve"> component</w:t>
       </w:r>
       <w:r>
+        <w:rPr>
+          <w:rFonts w:ascii="Aptos Display" w:hAnsi="Aptos Display" w:cs="Aptos Display" w:asciiTheme="majorHAnsi" w:hAnsiTheme="majorHAnsi" w:eastAsiaTheme="majorEastAsia" w:csTheme="majorBidi"/>
+          <w:color w:val="0F4761" w:themeColor="accent1" w:themeShade="BF"/>
+          <w:sz w:val="32"/>
+          <w:szCs w:val="32"/>
+        </w:rPr>
         <w:t>:</w:t>
       </w:r>
     </w:p>
@@ -335,8 +391,14 @@
           <w:ilvl w:val="0"/>
           <w:numId w:val="5"/>
         </w:numPr>
-      </w:pPr>
-      <w:r>
+        <w:ind w:left="720" w:hanging="360"/>
+      </w:pPr>
+      <w:r>
+        <w:rPr>
+          <w:rFonts w:ascii="Aptos" w:hAnsi="Aptos" w:eastAsia="Aptos" w:cs="Aptos" w:asciiTheme="minorHAnsi" w:hAnsiTheme="minorHAnsi" w:eastAsiaTheme="minorHAnsi" w:csTheme="minorBidi"/>
+          <w:sz w:val="24"/>
+          <w:szCs w:val="24"/>
+        </w:rPr>
         <w:t>Text processing and term extraction</w:t>
       </w:r>
     </w:p>
@@ -347,29 +409,70 @@
           <w:ilvl w:val="0"/>
           <w:numId w:val="5"/>
         </w:numPr>
-      </w:pPr>
-      <w:r>
+        <w:ind w:left="720" w:hanging="360"/>
+      </w:pPr>
+      <w:r>
+        <w:rPr>
+          <w:rFonts w:ascii="Aptos" w:hAnsi="Aptos" w:eastAsia="Aptos" w:cs="Aptos" w:asciiTheme="minorHAnsi" w:hAnsiTheme="minorHAnsi" w:eastAsiaTheme="minorHAnsi" w:csTheme="minorBidi"/>
+          <w:sz w:val="24"/>
+          <w:szCs w:val="24"/>
+        </w:rPr>
         <w:t xml:space="preserve">Wikidata candidate retrieval: </w:t>
       </w:r>
       <w:r>
+        <w:rPr>
+          <w:rFonts w:ascii="Aptos" w:hAnsi="Aptos" w:eastAsia="Aptos" w:cs="Aptos" w:asciiTheme="minorHAnsi" w:hAnsiTheme="minorHAnsi" w:eastAsiaTheme="minorHAnsi" w:csTheme="minorBidi"/>
+          <w:sz w:val="24"/>
+          <w:szCs w:val="24"/>
+        </w:rPr>
         <w:t>Retr</w:t>
       </w:r>
       <w:r>
+        <w:rPr>
+          <w:rFonts w:ascii="Aptos" w:hAnsi="Aptos" w:eastAsia="Aptos" w:cs="Aptos" w:asciiTheme="minorHAnsi" w:hAnsiTheme="minorHAnsi" w:eastAsiaTheme="minorHAnsi" w:csTheme="minorBidi"/>
+          <w:sz w:val="24"/>
+          <w:szCs w:val="24"/>
+        </w:rPr>
         <w:t>ie</w:t>
       </w:r>
       <w:r>
+        <w:rPr>
+          <w:rFonts w:ascii="Aptos" w:hAnsi="Aptos" w:eastAsia="Aptos" w:cs="Aptos" w:asciiTheme="minorHAnsi" w:hAnsiTheme="minorHAnsi" w:eastAsiaTheme="minorHAnsi" w:csTheme="minorBidi"/>
+          <w:sz w:val="24"/>
+          <w:szCs w:val="24"/>
+        </w:rPr>
         <w:t>ved candidate</w:t>
       </w:r>
       <w:r>
+        <w:rPr>
+          <w:rFonts w:ascii="Aptos" w:hAnsi="Aptos" w:eastAsia="Aptos" w:cs="Aptos" w:asciiTheme="minorHAnsi" w:hAnsiTheme="minorHAnsi" w:eastAsiaTheme="minorHAnsi" w:csTheme="minorBidi"/>
+          <w:sz w:val="24"/>
+          <w:szCs w:val="24"/>
+        </w:rPr>
         <w:t xml:space="preserve"> (from </w:t>
       </w:r>
       <w:r>
+        <w:rPr>
+          <w:rFonts w:ascii="Aptos" w:hAnsi="Aptos" w:eastAsia="Aptos" w:cs="Aptos" w:asciiTheme="minorHAnsi" w:hAnsiTheme="minorHAnsi" w:eastAsiaTheme="minorHAnsi" w:csTheme="minorBidi"/>
+          <w:sz w:val="24"/>
+          <w:szCs w:val="24"/>
+        </w:rPr>
         <w:t>W</w:t>
       </w:r>
       <w:r>
+        <w:rPr>
+          <w:rFonts w:ascii="Aptos" w:hAnsi="Aptos" w:eastAsia="Aptos" w:cs="Aptos" w:asciiTheme="minorHAnsi" w:hAnsiTheme="minorHAnsi" w:eastAsiaTheme="minorHAnsi" w:csTheme="minorBidi"/>
+          <w:sz w:val="24"/>
+          <w:szCs w:val="24"/>
+        </w:rPr>
         <w:t>ikidata API)</w:t>
       </w:r>
       <w:r>
+        <w:rPr>
+          <w:rFonts w:ascii="Aptos" w:hAnsi="Aptos" w:eastAsia="Aptos" w:cs="Aptos" w:asciiTheme="minorHAnsi" w:hAnsiTheme="minorHAnsi" w:eastAsiaTheme="minorHAnsi" w:csTheme="minorBidi"/>
+          <w:sz w:val="24"/>
+          <w:szCs w:val="24"/>
+        </w:rPr>
         <w:t xml:space="preserve"> should have QID, labels, description, aliases</w:t>
       </w:r>
     </w:p>
@@ -380,8 +483,14 @@
           <w:ilvl w:val="0"/>
           <w:numId w:val="5"/>
         </w:numPr>
-      </w:pPr>
-      <w:r>
+        <w:ind w:left="720" w:hanging="360"/>
+      </w:pPr>
+      <w:r>
+        <w:rPr>
+          <w:rFonts w:ascii="Aptos" w:hAnsi="Aptos" w:eastAsia="Aptos" w:cs="Aptos" w:asciiTheme="minorHAnsi" w:hAnsiTheme="minorHAnsi" w:eastAsiaTheme="minorHAnsi" w:csTheme="minorBidi"/>
+          <w:sz w:val="24"/>
+          <w:szCs w:val="24"/>
+        </w:rPr>
         <w:t>Knowledge graph enrichment</w:t>
       </w:r>
     </w:p>
@@ -392,17 +501,38 @@
           <w:ilvl w:val="0"/>
           <w:numId w:val="5"/>
         </w:numPr>
-      </w:pPr>
-      <w:r>
+        <w:ind w:left="720" w:hanging="360"/>
+      </w:pPr>
+      <w:r>
+        <w:rPr>
+          <w:rFonts w:ascii="Aptos" w:hAnsi="Aptos" w:eastAsia="Aptos" w:cs="Aptos" w:asciiTheme="minorHAnsi" w:hAnsiTheme="minorHAnsi" w:eastAsiaTheme="minorHAnsi" w:csTheme="minorBidi"/>
+          <w:sz w:val="24"/>
+          <w:szCs w:val="24"/>
+        </w:rPr>
         <w:t>GraphRAG</w:t>
       </w:r>
       <w:r>
+        <w:rPr>
+          <w:rFonts w:ascii="Aptos" w:hAnsi="Aptos" w:eastAsia="Aptos" w:cs="Aptos" w:asciiTheme="minorHAnsi" w:hAnsiTheme="minorHAnsi" w:eastAsiaTheme="minorHAnsi" w:csTheme="minorBidi"/>
+          <w:sz w:val="24"/>
+          <w:szCs w:val="24"/>
+        </w:rPr>
         <w:t>-</w:t>
       </w:r>
       <w:r>
+        <w:rPr>
+          <w:rFonts w:ascii="Aptos" w:hAnsi="Aptos" w:eastAsia="Aptos" w:cs="Aptos" w:asciiTheme="minorHAnsi" w:hAnsiTheme="minorHAnsi" w:eastAsiaTheme="minorHAnsi" w:csTheme="minorBidi"/>
+          <w:sz w:val="24"/>
+          <w:szCs w:val="24"/>
+        </w:rPr>
         <w:t>based candidate selection</w:t>
       </w:r>
       <w:r>
+        <w:rPr>
+          <w:rFonts w:ascii="Aptos" w:hAnsi="Aptos" w:eastAsia="Aptos" w:cs="Aptos" w:asciiTheme="minorHAnsi" w:hAnsiTheme="minorHAnsi" w:eastAsiaTheme="minorHAnsi" w:csTheme="minorBidi"/>
+          <w:sz w:val="24"/>
+          <w:szCs w:val="24"/>
+        </w:rPr>
         <w:t>:</w:t>
       </w:r>
     </w:p>
@@ -413,14 +543,30 @@
           <w:ilvl w:val="1"/>
           <w:numId w:val="5"/>
         </w:numPr>
-      </w:pPr>
-      <w:r>
+        <w:ind w:left="1440" w:hanging="360"/>
+      </w:pPr>
+      <w:r>
+        <w:rPr>
+          <w:rFonts w:ascii="Aptos" w:hAnsi="Aptos" w:eastAsia="Aptos" w:cs="Aptos" w:asciiTheme="minorHAnsi" w:hAnsiTheme="minorHAnsi" w:eastAsiaTheme="minorHAnsi" w:csTheme="minorBidi"/>
+          <w:sz w:val="24"/>
+          <w:szCs w:val="24"/>
+        </w:rPr>
         <w:t xml:space="preserve">Mention context against the candidate fetched from </w:t>
       </w:r>
       <w:r>
+        <w:rPr>
+          <w:rFonts w:ascii="Aptos" w:hAnsi="Aptos" w:eastAsia="Aptos" w:cs="Aptos" w:asciiTheme="minorHAnsi" w:hAnsiTheme="minorHAnsi" w:eastAsiaTheme="minorHAnsi" w:csTheme="minorBidi"/>
+          <w:sz w:val="24"/>
+          <w:szCs w:val="24"/>
+        </w:rPr>
         <w:t>W</w:t>
       </w:r>
       <w:r>
+        <w:rPr>
+          <w:rFonts w:ascii="Aptos" w:hAnsi="Aptos" w:eastAsia="Aptos" w:cs="Aptos" w:asciiTheme="minorHAnsi" w:hAnsiTheme="minorHAnsi" w:eastAsiaTheme="minorHAnsi" w:csTheme="minorBidi"/>
+          <w:sz w:val="24"/>
+          <w:szCs w:val="24"/>
+        </w:rPr>
         <w:t>ikidata (with graphical context)</w:t>
       </w:r>
     </w:p>
@@ -431,20 +577,46 @@
           <w:ilvl w:val="1"/>
           <w:numId w:val="5"/>
         </w:numPr>
-      </w:pPr>
-      <w:r>
+        <w:ind w:left="1440" w:hanging="360"/>
+      </w:pPr>
+      <w:r>
+        <w:rPr>
+          <w:rFonts w:ascii="Aptos" w:hAnsi="Aptos" w:eastAsia="Aptos" w:cs="Aptos" w:asciiTheme="minorHAnsi" w:hAnsiTheme="minorHAnsi" w:eastAsiaTheme="minorHAnsi" w:csTheme="minorBidi"/>
+          <w:sz w:val="24"/>
+          <w:szCs w:val="24"/>
+        </w:rPr>
         <w:t>Only s</w:t>
       </w:r>
       <w:r>
+        <w:rPr>
+          <w:rFonts w:ascii="Aptos" w:hAnsi="Aptos" w:eastAsia="Aptos" w:cs="Aptos" w:asciiTheme="minorHAnsi" w:hAnsiTheme="minorHAnsi" w:eastAsiaTheme="minorHAnsi" w:csTheme="minorBidi"/>
+          <w:sz w:val="24"/>
+          <w:szCs w:val="24"/>
+        </w:rPr>
         <w:t>elect t</w:t>
       </w:r>
       <w:r>
+        <w:rPr>
+          <w:rFonts w:ascii="Aptos" w:hAnsi="Aptos" w:eastAsia="Aptos" w:cs="Aptos" w:asciiTheme="minorHAnsi" w:hAnsiTheme="minorHAnsi" w:eastAsiaTheme="minorHAnsi" w:csTheme="minorBidi"/>
+          <w:sz w:val="24"/>
+          <w:szCs w:val="24"/>
+        </w:rPr>
         <w:t>he highest</w:t>
       </w:r>
       <w:r>
+        <w:rPr>
+          <w:rFonts w:ascii="Aptos" w:hAnsi="Aptos" w:eastAsia="Aptos" w:cs="Aptos" w:asciiTheme="minorHAnsi" w:hAnsiTheme="minorHAnsi" w:eastAsiaTheme="minorHAnsi" w:csTheme="minorBidi"/>
+          <w:sz w:val="24"/>
+          <w:szCs w:val="24"/>
+        </w:rPr>
         <w:t>-</w:t>
       </w:r>
       <w:r>
+        <w:rPr>
+          <w:rFonts w:ascii="Aptos" w:hAnsi="Aptos" w:eastAsia="Aptos" w:cs="Aptos" w:asciiTheme="minorHAnsi" w:hAnsiTheme="minorHAnsi" w:eastAsiaTheme="minorHAnsi" w:csTheme="minorBidi"/>
+          <w:sz w:val="24"/>
+          <w:szCs w:val="24"/>
+        </w:rPr>
         <w:t>ranked candidate when sufficient evidence is available.</w:t>
       </w:r>
     </w:p>
@@ -455,23 +627,54 @@
           <w:ilvl w:val="1"/>
           <w:numId w:val="5"/>
         </w:numPr>
-      </w:pPr>
-      <w:r>
+        <w:ind w:left="1440" w:hanging="360"/>
+      </w:pPr>
+      <w:r>
+        <w:rPr>
+          <w:rFonts w:ascii="Aptos" w:hAnsi="Aptos" w:eastAsia="Aptos" w:cs="Aptos" w:asciiTheme="minorHAnsi" w:hAnsiTheme="minorHAnsi" w:eastAsiaTheme="minorHAnsi" w:csTheme="minorBidi"/>
+          <w:sz w:val="24"/>
+          <w:szCs w:val="24"/>
+        </w:rPr>
         <w:t>Matching</w:t>
       </w:r>
       <w:r>
+        <w:rPr>
+          <w:rFonts w:ascii="Aptos" w:hAnsi="Aptos" w:eastAsia="Aptos" w:cs="Aptos" w:asciiTheme="minorHAnsi" w:hAnsiTheme="minorHAnsi" w:eastAsiaTheme="minorHAnsi" w:csTheme="minorBidi"/>
+          <w:sz w:val="24"/>
+          <w:szCs w:val="24"/>
+        </w:rPr>
         <w:t xml:space="preserve"> criterion</w:t>
       </w:r>
       <w:r>
+        <w:rPr>
+          <w:rFonts w:ascii="Aptos" w:hAnsi="Aptos" w:eastAsia="Aptos" w:cs="Aptos" w:asciiTheme="minorHAnsi" w:hAnsiTheme="minorHAnsi" w:eastAsiaTheme="minorHAnsi" w:csTheme="minorBidi"/>
+          <w:sz w:val="24"/>
+          <w:szCs w:val="24"/>
+        </w:rPr>
         <w:t xml:space="preserve">: </w:t>
       </w:r>
       <w:r>
+        <w:rPr>
+          <w:rFonts w:ascii="Aptos" w:hAnsi="Aptos" w:eastAsia="Aptos" w:cs="Aptos" w:asciiTheme="minorHAnsi" w:hAnsiTheme="minorHAnsi" w:eastAsiaTheme="minorHAnsi" w:csTheme="minorBidi"/>
+          <w:sz w:val="24"/>
+          <w:szCs w:val="24"/>
+        </w:rPr>
         <w:t>compare candidates based on textual relevance,</w:t>
       </w:r>
       <w:r>
+        <w:rPr>
+          <w:rFonts w:ascii="Aptos" w:hAnsi="Aptos" w:eastAsia="Aptos" w:cs="Aptos" w:asciiTheme="minorHAnsi" w:hAnsiTheme="minorHAnsi" w:eastAsiaTheme="minorHAnsi" w:csTheme="minorBidi"/>
+          <w:sz w:val="24"/>
+          <w:szCs w:val="24"/>
+        </w:rPr>
         <w:t xml:space="preserve"> </w:t>
       </w:r>
       <w:r>
+        <w:rPr>
+          <w:rFonts w:ascii="Aptos" w:hAnsi="Aptos" w:eastAsia="Aptos" w:cs="Aptos" w:asciiTheme="minorHAnsi" w:hAnsiTheme="minorHAnsi" w:eastAsiaTheme="minorHAnsi" w:csTheme="minorBidi"/>
+          <w:sz w:val="24"/>
+          <w:szCs w:val="24"/>
+        </w:rPr>
         <w:t>entity types, and connections to other concepts mentioned in the text.</w:t>
       </w:r>
     </w:p>
@@ -482,14 +685,30 @@
           <w:ilvl w:val="0"/>
           <w:numId w:val="5"/>
         </w:numPr>
-      </w:pPr>
-      <w:r>
+        <w:ind w:left="720" w:hanging="360"/>
+      </w:pPr>
+      <w:r>
+        <w:rPr>
+          <w:rFonts w:ascii="Aptos" w:hAnsi="Aptos" w:eastAsia="Aptos" w:cs="Aptos" w:asciiTheme="minorHAnsi" w:hAnsiTheme="minorHAnsi" w:eastAsiaTheme="minorHAnsi" w:csTheme="minorBidi"/>
+          <w:sz w:val="24"/>
+          <w:szCs w:val="24"/>
+        </w:rPr>
         <w:t>Output</w:t>
       </w:r>
       <w:r>
+        <w:rPr>
+          <w:rFonts w:ascii="Aptos" w:hAnsi="Aptos" w:eastAsia="Aptos" w:cs="Aptos" w:asciiTheme="minorHAnsi" w:hAnsiTheme="minorHAnsi" w:eastAsiaTheme="minorHAnsi" w:csTheme="minorBidi"/>
+          <w:sz w:val="24"/>
+          <w:szCs w:val="24"/>
+        </w:rPr>
         <w:t>:</w:t>
       </w:r>
       <w:r>
+        <w:rPr>
+          <w:rFonts w:ascii="Aptos" w:hAnsi="Aptos" w:eastAsia="Aptos" w:cs="Aptos" w:asciiTheme="minorHAnsi" w:hAnsiTheme="minorHAnsi" w:eastAsiaTheme="minorHAnsi" w:csTheme="minorBidi"/>
+          <w:sz w:val="24"/>
+          <w:szCs w:val="24"/>
+        </w:rPr>
         <w:t xml:space="preserve"> a JSON:</w:t>
       </w:r>
     </w:p>
@@ -500,8 +719,14 @@
           <w:ilvl w:val="1"/>
           <w:numId w:val="5"/>
         </w:numPr>
-      </w:pPr>
-      <w:r>
+        <w:ind w:left="1440" w:hanging="360"/>
+      </w:pPr>
+      <w:r>
+        <w:rPr>
+          <w:rFonts w:ascii="Aptos" w:hAnsi="Aptos" w:eastAsia="Aptos" w:cs="Aptos" w:asciiTheme="minorHAnsi" w:hAnsiTheme="minorHAnsi" w:eastAsiaTheme="minorHAnsi" w:csTheme="minorBidi"/>
+          <w:sz w:val="24"/>
+          <w:szCs w:val="24"/>
+        </w:rPr>
         <w:t>original terms,</w:t>
       </w:r>
     </w:p>
@@ -512,8 +737,14 @@
           <w:ilvl w:val="1"/>
           <w:numId w:val="5"/>
         </w:numPr>
-      </w:pPr>
-      <w:r>
+        <w:ind w:left="1440" w:hanging="360"/>
+      </w:pPr>
+      <w:r>
+        <w:rPr>
+          <w:rFonts w:ascii="Aptos" w:hAnsi="Aptos" w:eastAsia="Aptos" w:cs="Aptos" w:asciiTheme="minorHAnsi" w:hAnsiTheme="minorHAnsi" w:eastAsiaTheme="minorHAnsi" w:csTheme="minorBidi"/>
+          <w:sz w:val="24"/>
+          <w:szCs w:val="24"/>
+        </w:rPr>
         <w:t xml:space="preserve">selected Wikidata concepts, </w:t>
       </w:r>
     </w:p>
@@ -524,8 +755,14 @@
           <w:ilvl w:val="2"/>
           <w:numId w:val="5"/>
         </w:numPr>
-      </w:pPr>
-      <w:r>
+        <w:ind w:left="2160" w:hanging="360"/>
+      </w:pPr>
+      <w:r>
+        <w:rPr>
+          <w:rFonts w:ascii="Aptos" w:hAnsi="Aptos" w:eastAsia="Aptos" w:cs="Aptos" w:asciiTheme="minorHAnsi" w:hAnsiTheme="minorHAnsi" w:eastAsiaTheme="minorHAnsi" w:csTheme="minorBidi"/>
+          <w:sz w:val="24"/>
+          <w:szCs w:val="24"/>
+        </w:rPr>
         <w:t>QIDs,</w:t>
       </w:r>
     </w:p>
@@ -536,8 +773,14 @@
           <w:ilvl w:val="1"/>
           <w:numId w:val="5"/>
         </w:numPr>
-      </w:pPr>
-      <w:r>
+        <w:ind w:left="1440" w:hanging="360"/>
+      </w:pPr>
+      <w:r>
+        <w:rPr>
+          <w:rFonts w:ascii="Aptos" w:hAnsi="Aptos" w:eastAsia="Aptos" w:cs="Aptos" w:asciiTheme="minorHAnsi" w:hAnsiTheme="minorHAnsi" w:eastAsiaTheme="minorHAnsi" w:csTheme="minorBidi"/>
+          <w:sz w:val="24"/>
+          <w:szCs w:val="24"/>
+        </w:rPr>
         <w:t xml:space="preserve">ranking scores, </w:t>
       </w:r>
     </w:p>
@@ -548,8 +791,14 @@
           <w:ilvl w:val="1"/>
           <w:numId w:val="5"/>
         </w:numPr>
-      </w:pPr>
-      <w:r>
+        <w:ind w:left="1440" w:hanging="360"/>
+      </w:pPr>
+      <w:r>
+        <w:rPr>
+          <w:rFonts w:ascii="Aptos" w:hAnsi="Aptos" w:eastAsia="Aptos" w:cs="Aptos" w:asciiTheme="minorHAnsi" w:hAnsiTheme="minorHAnsi" w:eastAsiaTheme="minorHAnsi" w:csTheme="minorBidi"/>
+          <w:sz w:val="24"/>
+          <w:szCs w:val="24"/>
+        </w:rPr>
         <w:t>alternative candidates,</w:t>
       </w:r>
     </w:p>
@@ -560,8 +809,14 @@
           <w:ilvl w:val="1"/>
           <w:numId w:val="5"/>
         </w:numPr>
-      </w:pPr>
-      <w:r>
+        <w:ind w:left="1440" w:hanging="360"/>
+      </w:pPr>
+      <w:r>
+        <w:rPr>
+          <w:rFonts w:ascii="Aptos" w:hAnsi="Aptos" w:eastAsia="Aptos" w:cs="Aptos" w:asciiTheme="minorHAnsi" w:hAnsiTheme="minorHAnsi" w:eastAsiaTheme="minorHAnsi" w:csTheme="minorBidi"/>
+          <w:sz w:val="24"/>
+          <w:szCs w:val="24"/>
+        </w:rPr>
         <w:t>supporting evidence</w:t>
       </w:r>
     </w:p>
@@ -572,11 +827,22 @@
           <w:ilvl w:val="0"/>
           <w:numId w:val="5"/>
         </w:numPr>
-      </w:pPr>
-      <w:r>
+        <w:ind w:left="720" w:hanging="360"/>
+      </w:pPr>
+      <w:r>
+        <w:rPr>
+          <w:rFonts w:ascii="Aptos" w:hAnsi="Aptos" w:eastAsia="Aptos" w:cs="Aptos" w:asciiTheme="minorHAnsi" w:hAnsiTheme="minorHAnsi" w:eastAsiaTheme="minorHAnsi" w:csTheme="minorBidi"/>
+          <w:sz w:val="24"/>
+          <w:szCs w:val="24"/>
+        </w:rPr>
         <w:t>Evaluation:</w:t>
       </w:r>
       <w:r>
+        <w:rPr>
+          <w:rFonts w:ascii="Aptos" w:hAnsi="Aptos" w:eastAsia="Aptos" w:cs="Aptos" w:asciiTheme="minorHAnsi" w:hAnsiTheme="minorHAnsi" w:eastAsiaTheme="minorHAnsi" w:csTheme="minorBidi"/>
+          <w:sz w:val="24"/>
+          <w:szCs w:val="24"/>
+        </w:rPr>
         <w:t xml:space="preserve"> evaluate on a small test set comprising of both</w:t>
       </w:r>
     </w:p>
@@ -587,8 +853,14 @@
           <w:ilvl w:val="4"/>
           <w:numId w:val="5"/>
         </w:numPr>
-      </w:pPr>
-      <w:r>
+        <w:ind w:left="3600" w:hanging="360"/>
+      </w:pPr>
+      <w:r>
+        <w:rPr>
+          <w:rFonts w:ascii="Aptos" w:hAnsi="Aptos" w:eastAsia="Aptos" w:cs="Aptos" w:asciiTheme="minorHAnsi" w:hAnsiTheme="minorHAnsi" w:eastAsiaTheme="minorHAnsi" w:csTheme="minorBidi"/>
+          <w:sz w:val="24"/>
+          <w:szCs w:val="24"/>
+        </w:rPr>
         <w:t>Ambiguous</w:t>
       </w:r>
     </w:p>
@@ -599,8 +871,14 @@
           <w:ilvl w:val="4"/>
           <w:numId w:val="5"/>
         </w:numPr>
-      </w:pPr>
-      <w:r>
+        <w:ind w:left="3600" w:hanging="360"/>
+      </w:pPr>
+      <w:r>
+        <w:rPr>
+          <w:rFonts w:ascii="Aptos" w:hAnsi="Aptos" w:eastAsia="Aptos" w:cs="Aptos" w:asciiTheme="minorHAnsi" w:hAnsiTheme="minorHAnsi" w:eastAsiaTheme="minorHAnsi" w:csTheme="minorBidi"/>
+          <w:sz w:val="24"/>
+          <w:szCs w:val="24"/>
+        </w:rPr>
         <w:t>Non-ambiguous terms</w:t>
       </w:r>
     </w:p>
@@ -611,8 +889,14 @@
           <w:ilvl w:val="4"/>
           <w:numId w:val="5"/>
         </w:numPr>
-      </w:pPr>
-      <w:r>
+        <w:ind w:left="3600" w:hanging="360"/>
+      </w:pPr>
+      <w:r>
+        <w:rPr>
+          <w:rFonts w:ascii="Aptos" w:hAnsi="Aptos" w:eastAsia="Aptos" w:cs="Aptos" w:asciiTheme="minorHAnsi" w:hAnsiTheme="minorHAnsi" w:eastAsiaTheme="minorHAnsi" w:csTheme="minorBidi"/>
+          <w:sz w:val="24"/>
+          <w:szCs w:val="24"/>
+        </w:rPr>
         <w:t>Baseline: without graph context</w:t>
       </w:r>
     </w:p>
@@ -623,8 +907,14 @@
           <w:ilvl w:val="4"/>
           <w:numId w:val="5"/>
         </w:numPr>
-      </w:pPr>
-      <w:r>
+        <w:ind w:left="3600" w:hanging="360"/>
+      </w:pPr>
+      <w:r>
+        <w:rPr>
+          <w:rFonts w:ascii="Aptos" w:hAnsi="Aptos" w:eastAsia="Aptos" w:cs="Aptos" w:asciiTheme="minorHAnsi" w:hAnsiTheme="minorHAnsi" w:eastAsiaTheme="minorHAnsi" w:csTheme="minorBidi"/>
+          <w:sz w:val="24"/>
+          <w:szCs w:val="24"/>
+        </w:rPr>
         <w:t>Advanced with graph context</w:t>
       </w:r>
     </w:p>
@@ -633,12 +923,125 @@
       <w:pPr>
         <w:pStyle w:val="Heading2"/>
       </w:pPr>
+    </w:p>
+    <w:p>
+      <w:pPr>
+        <w:pStyle w:val="Normal"/>
+      </w:pPr>
+      <w:r>
+        <w:rPr>
+          <w:b/>
+          <w:bCs/>
+          <w:sz w:val="28"/>
+          <w:szCs w:val="28"/>
+        </w:rPr>
+        <w:t>Dataset selection:</w:t>
+      </w:r>
+    </w:p>
+    <w:p>
+      <w:pPr>
+        <w:pStyle w:val="Normal"/>
+        <w:numPr>
+          <w:ilvl w:val="0"/>
+          <w:numId w:val="1"/>
+        </w:numPr>
+      </w:pPr>
+      <w:r>
+        <w:t>Sep 1: Dataset selection: Looked into open source entity linking datasets, with entity types beyond named entities.</w:t>
+      </w:r>
+    </w:p>
+    <w:p>
+      <w:pPr>
+        <w:pStyle w:val="Normal"/>
+        <w:numPr>
+          <w:ilvl w:val="1"/>
+          <w:numId w:val="1"/>
+        </w:numPr>
+      </w:pPr>
+      <w:r>
+        <w:t xml:space="preserve">Selected the </w:t>
+      </w:r>
+      <w:hyperlink r:id="rId7">
+        <w:r>
+          <w:rPr>
+            <w:rFonts w:ascii="Mona Sans VF" w:cs="Mona Sans VF"/>
+            <w:b/>
+            <w:bCs/>
+            <w:sz w:val="27"/>
+            <w:szCs w:val="27"/>
+            <w:u w:val="single"/>
+          </w:rPr>
+          <w:t>elevant</w:t>
+        </w:r>
+      </w:hyperlink>
+      <w:r>
+        <w:rPr>
+          <w:rFonts w:ascii="Mona Sans VF" w:cs="Mona Sans VF"/>
+          <w:b/>
+          <w:bCs/>
+          <w:sz w:val="27"/>
+          <w:szCs w:val="27"/>
+          <w:u w:val="single"/>
+        </w:rPr>
+        <w:t xml:space="preserve"> </w:t>
+      </w:r>
+      <w:r>
+        <w:rPr>
+          <w:rFonts w:ascii="Mona Sans VF" w:cs="Mona Sans VF"/>
+          <w:sz w:val="27"/>
+          <w:szCs w:val="27"/>
+        </w:rPr>
+        <w:t xml:space="preserve"> </w:t>
+      </w:r>
+      <w:r>
+        <w:rPr>
+          <w:rFonts w:ascii="Mona Sans VF" w:cs="Mona Sans VF"/>
+          <w:sz w:val="24"/>
+          <w:szCs w:val="24"/>
+        </w:rPr>
+        <w:t xml:space="preserve">dataset published by Uni Freiburg. This dataset contains entites beyond named entities. </w:t>
+      </w:r>
+    </w:p>
+    <w:p>
+      <w:pPr>
+        <w:pStyle w:val="Normal"/>
+        <w:numPr>
+          <w:ilvl w:val="0"/>
+          <w:numId w:val="1"/>
+        </w:numPr>
+      </w:pPr>
+      <w:r>
+        <w:t>Step 2: QID existence validation: As it is an old dataset, the given QIDs were validated. It was checked whether given QID still exists in Wikidata or not.</w:t>
+      </w:r>
+    </w:p>
+    <w:p>
+      <w:pPr>
+        <w:pStyle w:val="Normal"/>
+        <w:numPr>
+          <w:ilvl w:val="0"/>
+          <w:numId w:val="1"/>
+        </w:numPr>
+      </w:pPr>
+      <w:r>
+        <w:t>Step 3: Stratification: a stratified dataset was developed for ambiguous vs. non ambiguous mentions across the dataset itself.</w:t>
+      </w:r>
+    </w:p>
+    <w:p>
+      <w:pPr>
+        <w:pStyle w:val="Normal"/>
+        <w:numPr>
+          <w:ilvl w:val="1"/>
+          <w:numId w:val="1"/>
+        </w:numPr>
+      </w:pPr>
+      <w:r>
+        <w:t>Mentions with similar surface_form anf having more than one QID were flagged as ambiguous, as the mention string alone is not sufficient to disambiguate the mention.</w:t>
+      </w:r>
     </w:p>
     <w:p/>
     <w:sectPr>
       <w:pgSz w:w="11906" w:h="16838"/>
       <w:pgMar w:top="1440" w:right="1440" w:bottom="1440" w:left="1440" w:header="708" w:footer="708" w:gutter="0"/>
-      <w:cols w:space="708"/>
       <w:docGrid w:linePitch="360"/>
     </w:sectPr>
   </w:body>

</xml_diff>